<commit_message>
Added Variables to API Key and other values that were hardcoded
</commit_message>
<xml_diff>
--- a/Data/Input/Adjunct Reappointment - Template.docx
+++ b/Data/Input/Adjunct Reappointment - Template.docx
@@ -16,7 +16,7 @@
           <w:sz w:val="22"/>
           <w:szCs w:val="22"/>
         </w:rPr>
-        <w:t>February 20, 2026</w:t>
+        <w:t>February 24, 2026</w:t>
       </w:r>
     </w:p>
     <w:p>
@@ -58,7 +58,7 @@
           <w:sz w:val="22"/>
           <w:szCs w:val="22"/>
         </w:rPr>
-        <w:t>Ziyi Li</w:t>
+        <w:t>Rima Shah Chakrabarti</w:t>
       </w:r>
     </w:p>
     <w:p>
@@ -75,7 +75,7 @@
           <w:sz w:val="22"/>
           <w:szCs w:val="22"/>
         </w:rPr>
-        <w:t>zli16@mdanderson.org</w:t>
+        <w:t>Rchakr5@gmail.com</w:t>
       </w:r>
     </w:p>
     <w:p>
@@ -134,7 +134,7 @@
           <w:sz w:val="22"/>
           <w:szCs w:val="22"/>
         </w:rPr>
-        <w:t>Li</w:t>
+        <w:t>Chakrabarti</w:t>
       </w:r>
       <w:r>
         <w:rPr>
@@ -177,7 +177,7 @@
           <w:sz w:val="22"/>
           <w:szCs w:val="22"/>
         </w:rPr>
-        <w:t>Huixia Judy Wang</w:t>
+        <w:t>Cynthia Reinhart-King</w:t>
       </w:r>
       <w:r>
         <w:rPr>
@@ -193,7 +193,7 @@
           <w:sz w:val="22"/>
           <w:szCs w:val="22"/>
         </w:rPr>
-        <w:t>Adjunct Assistant Professor</w:t>
+        <w:t>Adjunct Professor In the Practice</w:t>
       </w:r>
       <w:r>
         <w:rPr>
@@ -218,7 +218,7 @@
           <w:sz w:val="22"/>
           <w:szCs w:val="22"/>
         </w:rPr>
-        <w:t>Statistics</w:t>
+        <w:t>Bioengineering</w:t>
       </w:r>
       <w:r>
         <w:rPr>
@@ -259,7 +259,7 @@
           <w:sz w:val="22"/>
           <w:szCs w:val="22"/>
         </w:rPr>
-        <w:t>July 1, 2026</w:t>
+        <w:t>January 1, 2026</w:t>
       </w:r>
       <w:r>
         <w:rPr>
@@ -283,7 +283,7 @@
           <w:sz w:val="22"/>
           <w:szCs w:val="22"/>
         </w:rPr>
-        <w:t>June 30, 2029</w:t>
+        <w:t>December 31, 2028</w:t>
       </w:r>
       <w:r>
         <w:rPr>
@@ -658,7 +658,7 @@
           <w:sz w:val="22"/>
           <w:szCs w:val="22"/>
         </w:rPr>
-        <w:t>Huixia Judy Wang</w:t>
+        <w:t>Cynthia Reinhart-King</w:t>
       </w:r>
       <w:r>
         <w:rPr>
@@ -745,7 +745,7 @@
           <w:sz w:val="22"/>
           <w:szCs w:val="22"/>
         </w:rPr>
-        <w:t>Ziyi Li</w:t>
+        <w:t>Rima Shah Chakrabarti</w:t>
       </w:r>
       <w:r>
         <w:tab/>

</xml_diff>

<commit_message>
Added Logs in the code
</commit_message>
<xml_diff>
--- a/Data/Input/Adjunct Reappointment - Template.docx
+++ b/Data/Input/Adjunct Reappointment - Template.docx
@@ -16,7 +16,7 @@
           <w:sz w:val="22"/>
           <w:szCs w:val="22"/>
         </w:rPr>
-        <w:t>February 24, 2026</w:t>
+        <w:t>February 25, 2026</w:t>
       </w:r>
     </w:p>
     <w:p>
@@ -58,7 +58,7 @@
           <w:sz w:val="22"/>
           <w:szCs w:val="22"/>
         </w:rPr>
-        <w:t>Rima Shah Chakrabarti</w:t>
+        <w:t>Konstantin V. Sokolov</w:t>
       </w:r>
     </w:p>
     <w:p>
@@ -75,7 +75,7 @@
           <w:sz w:val="22"/>
           <w:szCs w:val="22"/>
         </w:rPr>
-        <w:t>Rchakr5@gmail.com</w:t>
+        <w:t>ksokolov@mdanderson.org</w:t>
       </w:r>
     </w:p>
     <w:p>
@@ -134,7 +134,7 @@
           <w:sz w:val="22"/>
           <w:szCs w:val="22"/>
         </w:rPr>
-        <w:t>Chakrabarti</w:t>
+        <w:t>Sokolov</w:t>
       </w:r>
       <w:r>
         <w:rPr>
@@ -177,7 +177,7 @@
           <w:sz w:val="22"/>
           <w:szCs w:val="22"/>
         </w:rPr>
-        <w:t>Cynthia Reinhart-King</w:t>
+        <w:t>C. Fred Higgs III</w:t>
       </w:r>
       <w:r>
         <w:rPr>
@@ -193,7 +193,7 @@
           <w:sz w:val="22"/>
           <w:szCs w:val="22"/>
         </w:rPr>
-        <w:t>Adjunct Professor In the Practice</w:t>
+        <w:t>Adjunct Professor</w:t>
       </w:r>
       <w:r>
         <w:rPr>
@@ -259,7 +259,7 @@
           <w:sz w:val="22"/>
           <w:szCs w:val="22"/>
         </w:rPr>
-        <w:t>January 1, 2026</w:t>
+        <w:t>July 1, 2024</w:t>
       </w:r>
       <w:r>
         <w:rPr>
@@ -283,7 +283,7 @@
           <w:sz w:val="22"/>
           <w:szCs w:val="22"/>
         </w:rPr>
-        <w:t>December 31, 2028</w:t>
+        <w:t>June 30, 2027</w:t>
       </w:r>
       <w:r>
         <w:rPr>
@@ -652,22 +652,6 @@
         </w:rPr>
         <w:tab/>
       </w:r>
-      <w:r>
-        <w:rPr>
-          <w:rFonts w:cs="Helvetica"/>
-          <w:sz w:val="22"/>
-          <w:szCs w:val="22"/>
-        </w:rPr>
-        <w:t>Cynthia Reinhart-King</w:t>
-      </w:r>
-      <w:r>
-        <w:rPr>
-          <w:rFonts w:cs="Helvetica"/>
-          <w:sz w:val="22"/>
-          <w:szCs w:val="22"/>
-        </w:rPr>
-        <w:t>, Department Chair</w:t>
-      </w:r>
     </w:p>
     <w:p>
       <w:pPr>
@@ -745,7 +729,7 @@
           <w:sz w:val="22"/>
           <w:szCs w:val="22"/>
         </w:rPr>
-        <w:t>Rima Shah Chakrabarti</w:t>
+        <w:t>Konstantin V. Sokolov</w:t>
       </w:r>
       <w:r>
         <w:tab/>

</xml_diff>

<commit_message>
Added Logic after UAT
</commit_message>
<xml_diff>
--- a/Data/Input/Adjunct Reappointment - Template.docx
+++ b/Data/Input/Adjunct Reappointment - Template.docx
@@ -16,7 +16,7 @@
           <w:sz w:val="22"/>
           <w:szCs w:val="22"/>
         </w:rPr>
-        <w:t>February 27, 2026</w:t>
+        <w:t>March 13, 2026</w:t>
       </w:r>
     </w:p>
     <w:p>
@@ -42,23 +42,15 @@
           <w:sz w:val="22"/>
           <w:szCs w:val="22"/>
         </w:rPr>
-        <w:t>Dr.</w:t>
-      </w:r>
-      <w:r>
-        <w:rPr>
-          <w:rFonts w:cs="Helvetica"/>
-          <w:sz w:val="22"/>
-          <w:szCs w:val="22"/>
-        </w:rPr>
-        <w:t xml:space="preserve"> </w:t>
-      </w:r>
-      <w:r>
-        <w:rPr>
-          <w:rFonts w:cs="Helvetica"/>
-          <w:sz w:val="22"/>
-          <w:szCs w:val="22"/>
-        </w:rPr>
-        <w:t>Rima Shah Chakrabarti</w:t>
+        <w:t xml:space="preserve">Dr. </w:t>
+      </w:r>
+      <w:r>
+        <w:rPr>
+          <w:rFonts w:cs="Helvetica"/>
+          <w:sz w:val="22"/>
+          <w:szCs w:val="22"/>
+        </w:rPr>
+        <w:t>Joseph A Ludwig</w:t>
       </w:r>
     </w:p>
     <w:p>
@@ -75,7 +67,7 @@
           <w:sz w:val="22"/>
           <w:szCs w:val="22"/>
         </w:rPr>
-        <w:t>Rchakr5@gmail.com</w:t>
+        <w:t>[Email Address]</w:t>
       </w:r>
     </w:p>
     <w:p>
@@ -95,64 +87,188 @@
           <w:szCs w:val="22"/>
         </w:rPr>
       </w:pPr>
+      <w:r>
+        <w:rPr>
+          <w:rFonts w:cs="Helvetica"/>
+          <w:sz w:val="22"/>
+          <w:szCs w:val="22"/>
+        </w:rPr>
+        <w:t xml:space="preserve">Dear Dr. </w:t>
+      </w:r>
+      <w:r>
+        <w:rPr>
+          <w:rFonts w:cs="Helvetica"/>
+          <w:sz w:val="22"/>
+          <w:szCs w:val="22"/>
+        </w:rPr>
+        <w:t>Ludwig</w:t>
+      </w:r>
+      <w:r>
+        <w:rPr>
+          <w:rFonts w:cs="Helvetica"/>
+          <w:sz w:val="22"/>
+          <w:szCs w:val="22"/>
+        </w:rPr>
+        <w:t>,</w:t>
+      </w:r>
     </w:p>
     <w:p>
       <w:pPr>
-        <w:rPr>
-          <w:rFonts w:cs="Helvetica"/>
-          <w:sz w:val="22"/>
-          <w:szCs w:val="22"/>
-        </w:rPr>
-      </w:pPr>
-      <w:r>
-        <w:rPr>
-          <w:rFonts w:cs="Helvetica"/>
-          <w:sz w:val="22"/>
-          <w:szCs w:val="22"/>
-        </w:rPr>
-        <w:t>Dear</w:t>
-      </w:r>
-      <w:r>
-        <w:rPr>
-          <w:rFonts w:cs="Helvetica"/>
-          <w:sz w:val="22"/>
-          <w:szCs w:val="22"/>
-        </w:rPr>
-        <w:t xml:space="preserve"> Dr.</w:t>
-      </w:r>
-      <w:r>
-        <w:rPr>
-          <w:rFonts w:cs="Helvetica"/>
-          <w:sz w:val="22"/>
-          <w:szCs w:val="22"/>
-        </w:rPr>
-        <w:t xml:space="preserve"> </w:t>
-      </w:r>
-      <w:r>
-        <w:rPr>
-          <w:rFonts w:cs="Helvetica"/>
-          <w:sz w:val="22"/>
-          <w:szCs w:val="22"/>
-        </w:rPr>
-        <w:t>Chakrabarti</w:t>
-      </w:r>
-      <w:r>
-        <w:rPr>
-          <w:rFonts w:cs="Helvetica"/>
-          <w:sz w:val="22"/>
-          <w:szCs w:val="22"/>
-        </w:rPr>
-        <w:t>,</w:t>
-      </w:r>
+        <w:jc w:val="both"/>
+        <w:rPr>
+          <w:rFonts w:cs="Helvetica"/>
+          <w:sz w:val="22"/>
+          <w:szCs w:val="22"/>
+        </w:rPr>
+      </w:pPr>
     </w:p>
     <w:p>
       <w:pPr>
-        <w:rPr>
-          <w:rFonts w:cs="Helvetica"/>
-          <w:sz w:val="22"/>
-          <w:szCs w:val="22"/>
-        </w:rPr>
-      </w:pPr>
+        <w:jc w:val="both"/>
+        <w:rPr>
+          <w:rFonts w:cs="Helvetica"/>
+          <w:sz w:val="22"/>
+          <w:szCs w:val="22"/>
+        </w:rPr>
+      </w:pPr>
+      <w:r>
+        <w:rPr>
+          <w:rFonts w:cs="Helvetica"/>
+          <w:sz w:val="22"/>
+          <w:szCs w:val="22"/>
+        </w:rPr>
+        <w:t>On the recommendation of</w:t>
+      </w:r>
+      <w:r>
+        <w:rPr>
+          <w:rFonts w:cs="Helvetica"/>
+          <w:sz w:val="22"/>
+          <w:szCs w:val="22"/>
+        </w:rPr>
+        <w:t xml:space="preserve"> Professor</w:t>
+      </w:r>
+      <w:r>
+        <w:rPr>
+          <w:rFonts w:cs="Helvetica"/>
+          <w:sz w:val="22"/>
+          <w:szCs w:val="22"/>
+        </w:rPr>
+        <w:t xml:space="preserve"> </w:t>
+      </w:r>
+      <w:r>
+        <w:rPr>
+          <w:rFonts w:cs="Helvetica"/>
+          <w:sz w:val="22"/>
+          <w:szCs w:val="22"/>
+        </w:rPr>
+        <w:t>Cynthia Reinhart-King</w:t>
+      </w:r>
+      <w:r>
+        <w:rPr>
+          <w:rFonts w:cs="Helvetica"/>
+          <w:sz w:val="22"/>
+          <w:szCs w:val="22"/>
+        </w:rPr>
+        <w:t xml:space="preserve">, I am pleased to reappoint you to the position of </w:t>
+      </w:r>
+      <w:r>
+        <w:rPr>
+          <w:rFonts w:cs="Helvetica"/>
+          <w:sz w:val="22"/>
+          <w:szCs w:val="22"/>
+        </w:rPr>
+        <w:t>Adjunct Professor</w:t>
+      </w:r>
+      <w:r>
+        <w:rPr>
+          <w:rFonts w:cs="Helvetica"/>
+          <w:color w:val="FF0000"/>
+          <w:sz w:val="22"/>
+          <w:szCs w:val="22"/>
+        </w:rPr>
+        <w:t xml:space="preserve"> </w:t>
+      </w:r>
+      <w:r>
+        <w:rPr>
+          <w:rFonts w:cs="Helvetica"/>
+          <w:sz w:val="22"/>
+          <w:szCs w:val="22"/>
+        </w:rPr>
+        <w:t xml:space="preserve">in the Department of </w:t>
+      </w:r>
+      <w:r>
+        <w:rPr>
+          <w:rFonts w:cs="Helvetica"/>
+          <w:sz w:val="22"/>
+          <w:szCs w:val="22"/>
+        </w:rPr>
+        <w:t>Bioengineering</w:t>
+      </w:r>
+      <w:r>
+        <w:rPr>
+          <w:rFonts w:cs="Helvetica"/>
+          <w:color w:val="FF0000"/>
+          <w:sz w:val="22"/>
+          <w:szCs w:val="22"/>
+        </w:rPr>
+        <w:t xml:space="preserve"> </w:t>
+      </w:r>
+      <w:r>
+        <w:rPr>
+          <w:rFonts w:cs="Helvetica"/>
+          <w:sz w:val="22"/>
+          <w:szCs w:val="22"/>
+        </w:rPr>
+        <w:t xml:space="preserve">at Rice University for the period of </w:t>
+      </w:r>
+      <w:r>
+        <w:rPr>
+          <w:rFonts w:cs="Helvetica"/>
+          <w:sz w:val="22"/>
+          <w:szCs w:val="22"/>
+        </w:rPr>
+        <w:t>three years</w:t>
+      </w:r>
+      <w:r>
+        <w:rPr>
+          <w:rFonts w:cs="Helvetica"/>
+          <w:sz w:val="22"/>
+          <w:szCs w:val="22"/>
+        </w:rPr>
+        <w:t xml:space="preserve">, beginning </w:t>
+      </w:r>
+      <w:r>
+        <w:rPr>
+          <w:rFonts w:cs="Helvetica"/>
+          <w:sz w:val="22"/>
+          <w:szCs w:val="22"/>
+        </w:rPr>
+        <w:t>July 1, 2024</w:t>
+      </w:r>
+      <w:r>
+        <w:rPr>
+          <w:rFonts w:cs="Helvetica"/>
+          <w:sz w:val="22"/>
+          <w:szCs w:val="22"/>
+        </w:rPr>
+        <w:t xml:space="preserve">, through </w:t>
+      </w:r>
+      <w:r>
+        <w:rPr>
+          <w:rFonts w:cs="Helvetica"/>
+          <w:sz w:val="22"/>
+          <w:szCs w:val="22"/>
+        </w:rPr>
+        <w:t>June 30, 2027</w:t>
+      </w:r>
+      <w:r>
+        <w:rPr>
+          <w:rFonts w:cs="Helvetica"/>
+          <w:sz w:val="22"/>
+          <w:szCs w:val="22"/>
+        </w:rPr>
+        <w:t>. All other terms and conditions of your appointment remain the same.</w:t>
+      </w:r>
     </w:p>
     <w:p>
       <w:pPr>
@@ -163,136 +279,6 @@
           <w:szCs w:val="22"/>
         </w:rPr>
       </w:pPr>
-      <w:r>
-        <w:rPr>
-          <w:rFonts w:cs="Helvetica"/>
-          <w:sz w:val="22"/>
-          <w:szCs w:val="22"/>
-        </w:rPr>
-        <w:t xml:space="preserve">On the recommendation of </w:t>
-      </w:r>
-      <w:r>
-        <w:rPr>
-          <w:rFonts w:cs="Helvetica"/>
-          <w:sz w:val="22"/>
-          <w:szCs w:val="22"/>
-        </w:rPr>
-        <w:t>Cynthia Reinhart-King</w:t>
-      </w:r>
-      <w:r>
-        <w:rPr>
-          <w:rFonts w:cs="Helvetica"/>
-          <w:sz w:val="22"/>
-          <w:szCs w:val="22"/>
-        </w:rPr>
-        <w:t xml:space="preserve">, I am pleased to reappoint you to the position of </w:t>
-      </w:r>
-      <w:r>
-        <w:rPr>
-          <w:rFonts w:cs="Helvetica"/>
-          <w:sz w:val="22"/>
-          <w:szCs w:val="22"/>
-        </w:rPr>
-        <w:t>Adjunct Professor In the Practice</w:t>
-      </w:r>
-      <w:r>
-        <w:rPr>
-          <w:rFonts w:cs="Helvetica"/>
-          <w:color w:val="FF0000"/>
-          <w:sz w:val="22"/>
-          <w:szCs w:val="22"/>
-        </w:rPr>
-        <w:t xml:space="preserve"> </w:t>
-      </w:r>
-      <w:r>
-        <w:rPr>
-          <w:rFonts w:cs="Helvetica"/>
-          <w:sz w:val="22"/>
-          <w:szCs w:val="22"/>
-        </w:rPr>
-        <w:t xml:space="preserve">in the Department of </w:t>
-      </w:r>
-      <w:r>
-        <w:rPr>
-          <w:rFonts w:cs="Helvetica"/>
-          <w:sz w:val="22"/>
-          <w:szCs w:val="22"/>
-        </w:rPr>
-        <w:t>Bioengineering</w:t>
-      </w:r>
-      <w:r>
-        <w:rPr>
-          <w:rFonts w:cs="Helvetica"/>
-          <w:color w:val="FF0000"/>
-          <w:sz w:val="22"/>
-          <w:szCs w:val="22"/>
-        </w:rPr>
-        <w:t xml:space="preserve"> </w:t>
-      </w:r>
-      <w:r>
-        <w:rPr>
-          <w:rFonts w:cs="Helvetica"/>
-          <w:sz w:val="22"/>
-          <w:szCs w:val="22"/>
-        </w:rPr>
-        <w:t xml:space="preserve">at Rice University for the period of </w:t>
-      </w:r>
-      <w:r>
-        <w:rPr>
-          <w:rFonts w:cs="Helvetica"/>
-          <w:sz w:val="22"/>
-          <w:szCs w:val="22"/>
-        </w:rPr>
-        <w:t>three years</w:t>
-      </w:r>
-      <w:r>
-        <w:rPr>
-          <w:rFonts w:cs="Helvetica"/>
-          <w:sz w:val="22"/>
-          <w:szCs w:val="22"/>
-        </w:rPr>
-        <w:t xml:space="preserve">, beginning </w:t>
-      </w:r>
-      <w:r>
-        <w:rPr>
-          <w:rFonts w:cs="Helvetica"/>
-          <w:sz w:val="22"/>
-          <w:szCs w:val="22"/>
-        </w:rPr>
-        <w:t>January 1, 2026</w:t>
-      </w:r>
-      <w:r>
-        <w:rPr>
-          <w:rFonts w:cs="Helvetica"/>
-          <w:sz w:val="22"/>
-          <w:szCs w:val="22"/>
-        </w:rPr>
-        <w:t xml:space="preserve">, </w:t>
-      </w:r>
-      <w:r>
-        <w:rPr>
-          <w:rFonts w:cs="Helvetica"/>
-          <w:sz w:val="22"/>
-          <w:szCs w:val="22"/>
-        </w:rPr>
-        <w:t xml:space="preserve">through </w:t>
-      </w:r>
-      <w:r>
-        <w:rPr>
-          <w:rFonts w:cs="Helvetica"/>
-          <w:sz w:val="22"/>
-          <w:szCs w:val="22"/>
-        </w:rPr>
-        <w:t>December 31, 2028</w:t>
-      </w:r>
-      <w:r>
-        <w:rPr>
-          <w:rFonts w:cs="Helvetica"/>
-          <w:sz w:val="22"/>
-          <w:szCs w:val="22"/>
-        </w:rPr>
-        <w:t>. All other terms and conditions of your appointment remain the same.</w:t>
-      </w:r>
     </w:p>
     <w:p>
       <w:pPr>
@@ -303,16 +289,6 @@
           <w:szCs w:val="22"/>
         </w:rPr>
       </w:pPr>
-    </w:p>
-    <w:p>
-      <w:pPr>
-        <w:jc w:val="both"/>
-        <w:rPr>
-          <w:rFonts w:cs="Helvetica"/>
-          <w:sz w:val="22"/>
-          <w:szCs w:val="22"/>
-        </w:rPr>
-      </w:pPr>
       <w:r>
         <w:rPr>
           <w:rFonts w:cs="Helvetica"/>
@@ -321,7 +297,7 @@
         </w:rPr>
         <w:t xml:space="preserve">Policy governing this appointment can be found under </w:t>
       </w:r>
-      <w:hyperlink r:id="rId10" w:history="1">
+      <w:hyperlink r:id="rId11" w:history="1">
         <w:r>
           <w:rPr>
             <w:rStyle w:val="Hyperlink"/>
@@ -366,55 +342,7 @@
           <w:sz w:val="22"/>
           <w:szCs w:val="22"/>
         </w:rPr>
-        <w:t>On behalf of all of our student</w:t>
-      </w:r>
-      <w:r>
-        <w:rPr>
-          <w:rFonts w:cs="Helvetica"/>
-          <w:sz w:val="22"/>
-          <w:szCs w:val="22"/>
-        </w:rPr>
-        <w:t>s</w:t>
-      </w:r>
-      <w:r>
-        <w:rPr>
-          <w:rFonts w:cs="Helvetica"/>
-          <w:sz w:val="22"/>
-          <w:szCs w:val="22"/>
-        </w:rPr>
-        <w:t xml:space="preserve"> and faculty colleagues, I thank you for your service to the School of Engineering and Computing and Rice University. We highly value our </w:t>
-      </w:r>
-      <w:r>
-        <w:rPr>
-          <w:rFonts w:cs="Helvetica"/>
-          <w:sz w:val="22"/>
-          <w:szCs w:val="22"/>
-        </w:rPr>
-        <w:t xml:space="preserve">adjunct faculty members and the connections we have with the friends, colleagues, and neighbors </w:t>
-      </w:r>
-      <w:r>
-        <w:rPr>
-          <w:rFonts w:cs="Helvetica"/>
-          <w:sz w:val="22"/>
-          <w:szCs w:val="22"/>
-        </w:rPr>
-        <w:t xml:space="preserve">you represent. We hope </w:t>
-      </w:r>
-      <w:r>
-        <w:rPr>
-          <w:rFonts w:cs="Helvetica"/>
-          <w:sz w:val="22"/>
-          <w:szCs w:val="22"/>
-        </w:rPr>
-        <w:t xml:space="preserve">your continued association with Rice will be </w:t>
-      </w:r>
-      <w:r>
-        <w:rPr>
-          <w:rFonts w:cs="Helvetica"/>
-          <w:sz w:val="22"/>
-          <w:szCs w:val="22"/>
-        </w:rPr>
-        <w:t>pleasant and productive.</w:t>
+        <w:t>On behalf of all of our students and faculty colleagues, I thank you for your service to the School of Engineering and Computing and Rice University. We highly value our adjunct faculty members and the connections we have with the friends, colleagues, and neighbors you represent. We hope your continued association with Rice will be pleasant and productive.</w:t>
       </w:r>
     </w:p>
     <w:p>
@@ -482,7 +410,7 @@
                     </pic:cNvPicPr>
                   </pic:nvPicPr>
                   <pic:blipFill>
-                    <a:blip r:embed="rId11">
+                    <a:blip r:embed="rId12">
                       <a:extLst>
                         <a:ext uri="{28A0092B-C50C-407E-A947-70E740481C1C}">
                           <a14:useLocalDpi xmlns:a14="http://schemas.microsoft.com/office/drawing/2010/main" val="0"/>
@@ -591,31 +519,40 @@
           <w:szCs w:val="22"/>
         </w:rPr>
       </w:pPr>
+      <w:r>
+        <w:rPr>
+          <w:rFonts w:cs="Helvetica"/>
+          <w:sz w:val="22"/>
+          <w:szCs w:val="22"/>
+        </w:rPr>
+        <w:t>cc:</w:t>
+      </w:r>
+      <w:r>
+        <w:rPr>
+          <w:rFonts w:cs="Helvetica"/>
+          <w:sz w:val="22"/>
+          <w:szCs w:val="22"/>
+        </w:rPr>
+        <w:tab/>
+        <w:t>C. Fred Higgs, III, Vice Provost for Academic Affairs</w:t>
+      </w:r>
     </w:p>
     <w:p>
       <w:pPr>
-        <w:rPr>
-          <w:rFonts w:cs="Helvetica"/>
-          <w:sz w:val="22"/>
-          <w:szCs w:val="22"/>
-        </w:rPr>
-      </w:pPr>
-      <w:r>
-        <w:rPr>
-          <w:rFonts w:cs="Helvetica"/>
-          <w:sz w:val="22"/>
-          <w:szCs w:val="22"/>
-        </w:rPr>
-        <w:t>cc:</w:t>
-      </w:r>
-      <w:r>
-        <w:rPr>
-          <w:rFonts w:cs="Helvetica"/>
-          <w:sz w:val="22"/>
-          <w:szCs w:val="22"/>
-        </w:rPr>
-        <w:tab/>
-        <w:t>C. Fred Higgs, III, Vice Provost for Academic Affairs</w:t>
+        <w:ind w:firstLine="720"/>
+        <w:rPr>
+          <w:rFonts w:cs="Helvetica"/>
+          <w:sz w:val="22"/>
+          <w:szCs w:val="22"/>
+        </w:rPr>
+      </w:pPr>
+      <w:r>
+        <w:rPr>
+          <w:rFonts w:cs="Helvetica"/>
+          <w:sz w:val="22"/>
+          <w:szCs w:val="22"/>
+        </w:rPr>
+        <w:t>Human Resources</w:t>
       </w:r>
     </w:p>
     <w:p>
@@ -633,7 +570,15 @@
           <w:sz w:val="22"/>
           <w:szCs w:val="22"/>
         </w:rPr>
-        <w:t>Human Resources</w:t>
+        <w:t>Cynthia Reinhart-King</w:t>
+      </w:r>
+      <w:r>
+        <w:rPr>
+          <w:rFonts w:cs="Helvetica"/>
+          <w:sz w:val="22"/>
+          <w:szCs w:val="22"/>
+        </w:rPr>
+        <w:t>, Department Chair</w:t>
       </w:r>
     </w:p>
     <w:p>
@@ -652,22 +597,6 @@
         </w:rPr>
         <w:tab/>
       </w:r>
-      <w:r>
-        <w:rPr>
-          <w:rFonts w:cs="Helvetica"/>
-          <w:sz w:val="22"/>
-          <w:szCs w:val="22"/>
-        </w:rPr>
-        <w:t>Cynthia Reinhart-King</w:t>
-      </w:r>
-      <w:r>
-        <w:rPr>
-          <w:rFonts w:cs="Helvetica"/>
-          <w:sz w:val="22"/>
-          <w:szCs w:val="22"/>
-        </w:rPr>
-        <w:t>, Department Chair</w:t>
-      </w:r>
     </w:p>
     <w:p>
       <w:pPr>
@@ -677,6 +606,227 @@
           <w:szCs w:val="22"/>
         </w:rPr>
       </w:pPr>
+      <w:r>
+        <w:rPr>
+          <w:rFonts w:cs="Helvetica"/>
+          <w:noProof/>
+          <w:sz w:val="22"/>
+          <w:szCs w:val="22"/>
+        </w:rPr>
+        <w:t xml:space="preserve"> </w:t>
+      </w:r>
+      <w:r>
+        <w:rPr>
+          <w:rFonts w:cs="Helvetica"/>
+          <w:noProof/>
+          <w:sz w:val="22"/>
+          <w:szCs w:val="22"/>
+        </w:rPr>
+        <mc:AlternateContent>
+          <mc:Choice Requires="wpg">
+            <w:drawing>
+              <wp:anchor distT="0" distB="0" distL="114300" distR="114300" simplePos="0" relativeHeight="251659264" behindDoc="0" locked="0" layoutInCell="1" allowOverlap="1" wp14:anchorId="7CF7EA18" wp14:editId="3D477D57">
+                <wp:simplePos x="0" y="0"/>
+                <wp:positionH relativeFrom="column">
+                  <wp:posOffset>821690</wp:posOffset>
+                </wp:positionH>
+                <wp:positionV relativeFrom="paragraph">
+                  <wp:posOffset>57150</wp:posOffset>
+                </wp:positionV>
+                <wp:extent cx="5238750" cy="538480"/>
+                <wp:effectExtent l="0" t="0" r="0" b="0"/>
+                <wp:wrapNone/>
+                <wp:docPr id="728541345" name="Agrupar 4"/>
+                <wp:cNvGraphicFramePr/>
+                <a:graphic xmlns:a="http://schemas.openxmlformats.org/drawingml/2006/main">
+                  <a:graphicData uri="http://schemas.microsoft.com/office/word/2010/wordprocessingGroup">
+                    <wpg:wgp>
+                      <wpg:cNvGrpSpPr/>
+                      <wpg:grpSpPr>
+                        <a:xfrm>
+                          <a:off x="0" y="0"/>
+                          <a:ext cx="5238750" cy="538480"/>
+                          <a:chOff x="266700" y="0"/>
+                          <a:chExt cx="5238750" cy="538480"/>
+                        </a:xfrm>
+                      </wpg:grpSpPr>
+                      <wps:wsp>
+                        <wps:cNvPr id="558819347" name="Caixa de Texto 2"/>
+                        <wps:cNvSpPr txBox="1">
+                          <a:spLocks noChangeArrowheads="1"/>
+                        </wps:cNvSpPr>
+                        <wps:spPr bwMode="auto">
+                          <a:xfrm>
+                            <a:off x="266700" y="0"/>
+                            <a:ext cx="3429000" cy="538480"/>
+                          </a:xfrm>
+                          <a:prstGeom prst="rect">
+                            <a:avLst/>
+                          </a:prstGeom>
+                          <a:noFill/>
+                          <a:ln w="9525">
+                            <a:noFill/>
+                            <a:miter lim="800000"/>
+                            <a:headEnd/>
+                            <a:tailEnd/>
+                          </a:ln>
+                        </wps:spPr>
+                        <wps:txbx>
+                          <w:txbxContent>
+                            <w:p>
+                              <w:pPr>
+                                <w:rPr>
+                                  <w:color w:val="FFFFFF" w:themeColor="background1"/>
+                                  <w:lang w:val="pt-BR"/>
+                                </w:rPr>
+                              </w:pPr>
+                              <w:r>
+                                <w:rPr>
+                                  <w:color w:val="FFFFFF" w:themeColor="background1"/>
+                                  <w:sz w:val="36"/>
+                                  <w:szCs w:val="28"/>
+                                </w:rPr>
+                                <w:t>{{Sig_es_:signer1:signature}}</w:t>
+                              </w:r>
+                            </w:p>
+                            <w:p>
+                              <w:pPr>
+                                <w:rPr>
+                                  <w:color w:val="FFFFFF" w:themeColor="background1"/>
+                                  <w:lang w:val="pt-BR"/>
+                                </w:rPr>
+                              </w:pPr>
+                            </w:p>
+                          </w:txbxContent>
+                        </wps:txbx>
+                        <wps:bodyPr rot="0" vert="horz" wrap="square" lIns="91440" tIns="45720" rIns="91440" bIns="45720" anchor="t" anchorCtr="0">
+                          <a:spAutoFit/>
+                        </wps:bodyPr>
+                      </wps:wsp>
+                      <wps:wsp>
+                        <wps:cNvPr id="1004395269" name="Caixa de Texto 2"/>
+                        <wps:cNvSpPr txBox="1">
+                          <a:spLocks noChangeArrowheads="1"/>
+                        </wps:cNvSpPr>
+                        <wps:spPr bwMode="auto">
+                          <a:xfrm>
+                            <a:off x="3581400" y="85725"/>
+                            <a:ext cx="1924050" cy="260985"/>
+                          </a:xfrm>
+                          <a:prstGeom prst="rect">
+                            <a:avLst/>
+                          </a:prstGeom>
+                          <a:noFill/>
+                          <a:ln w="9525">
+                            <a:noFill/>
+                            <a:miter lim="800000"/>
+                            <a:headEnd/>
+                            <a:tailEnd/>
+                          </a:ln>
+                        </wps:spPr>
+                        <wps:txbx>
+                          <w:txbxContent>
+                            <w:p>
+                              <w:pPr>
+                                <w:jc w:val="center"/>
+                                <w:rPr>
+                                  <w:color w:val="FFFFFF" w:themeColor="background1"/>
+                                  <w:sz w:val="10"/>
+                                  <w:szCs w:val="6"/>
+                                  <w:lang w:val="pt-BR"/>
+                                </w:rPr>
+                              </w:pPr>
+                              <w:r>
+                                <w:rPr>
+                                  <w:color w:val="FFFFFF" w:themeColor="background1"/>
+                                  <w:sz w:val="22"/>
+                                  <w:szCs w:val="12"/>
+                                </w:rPr>
+                                <w:t>{{Date_es_:signer1:date}}</w:t>
+                              </w:r>
+                            </w:p>
+                          </w:txbxContent>
+                        </wps:txbx>
+                        <wps:bodyPr rot="0" vert="horz" wrap="square" lIns="91440" tIns="45720" rIns="91440" bIns="45720" anchor="t" anchorCtr="0">
+                          <a:spAutoFit/>
+                        </wps:bodyPr>
+                      </wps:wsp>
+                    </wpg:wgp>
+                  </a:graphicData>
+                </a:graphic>
+                <wp14:sizeRelH relativeFrom="margin">
+                  <wp14:pctWidth>0</wp14:pctWidth>
+                </wp14:sizeRelH>
+              </wp:anchor>
+            </w:drawing>
+          </mc:Choice>
+          <mc:Fallback>
+            <w:pict>
+              <v:group w14:anchorId="7CF7EA18" id="Agrupar 4" o:spid="_x0000_s1026" style="position:absolute;margin-left:64.7pt;margin-top:4.5pt;width:412.5pt;height:42.4pt;z-index:251659264;mso-width-relative:margin" coordorigin="2667" coordsize="52387,5384" o:gfxdata="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">
+                <v:shapetype id="_x0000_t202" coordsize="21600,21600" o:spt="202" path="m,l,21600r21600,l21600,xe">
+                  <v:stroke joinstyle="miter"/>
+                  <v:path gradientshapeok="t" o:connecttype="rect"/>
+                </v:shapetype>
+                <v:shape id="Caixa de Texto 2" o:spid="_x0000_s1027" type="#_x0000_t202" style="position:absolute;left:2667;width:34290;height:5384;visibility:visible;mso-wrap-style:square;v-text-anchor:top" o:gfxdata="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" filled="f" stroked="f">
+                  <v:textbox style="mso-fit-shape-to-text:t">
+                    <w:txbxContent>
+                      <w:p>
+                        <w:pPr>
+                          <w:rPr>
+                            <w:color w:val="FFFFFF" w:themeColor="background1"/>
+                            <w:lang w:val="pt-BR"/>
+                          </w:rPr>
+                        </w:pPr>
+                        <w:r>
+                          <w:rPr>
+                            <w:color w:val="FFFFFF" w:themeColor="background1"/>
+                            <w:sz w:val="36"/>
+                            <w:szCs w:val="28"/>
+                          </w:rPr>
+                          <w:t>{{Sig_es_:signer1:signature}}</w:t>
+                        </w:r>
+                      </w:p>
+                      <w:p>
+                        <w:pPr>
+                          <w:rPr>
+                            <w:color w:val="FFFFFF" w:themeColor="background1"/>
+                            <w:lang w:val="pt-BR"/>
+                          </w:rPr>
+                        </w:pPr>
+                      </w:p>
+                    </w:txbxContent>
+                  </v:textbox>
+                </v:shape>
+                <v:shape id="Caixa de Texto 2" o:spid="_x0000_s1028" type="#_x0000_t202" style="position:absolute;left:35814;top:857;width:19240;height:2610;visibility:visible;mso-wrap-style:square;v-text-anchor:top" o:gfxdata="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" filled="f" stroked="f">
+                  <v:textbox style="mso-fit-shape-to-text:t">
+                    <w:txbxContent>
+                      <w:p>
+                        <w:pPr>
+                          <w:jc w:val="center"/>
+                          <w:rPr>
+                            <w:color w:val="FFFFFF" w:themeColor="background1"/>
+                            <w:sz w:val="10"/>
+                            <w:szCs w:val="6"/>
+                            <w:lang w:val="pt-BR"/>
+                          </w:rPr>
+                        </w:pPr>
+                        <w:r>
+                          <w:rPr>
+                            <w:color w:val="FFFFFF" w:themeColor="background1"/>
+                            <w:sz w:val="22"/>
+                            <w:szCs w:val="12"/>
+                          </w:rPr>
+                          <w:t>{{Date_es_:signer1:date}}</w:t>
+                        </w:r>
+                      </w:p>
+                    </w:txbxContent>
+                  </v:textbox>
+                </v:shape>
+              </v:group>
+            </w:pict>
+          </mc:Fallback>
+        </mc:AlternateContent>
+      </w:r>
     </w:p>
     <w:p>
       <w:pPr>
@@ -729,24 +879,76 @@
         <w:t>_________________</w:t>
       </w:r>
     </w:p>
+    <w:tbl>
+      <w:tblPr>
+        <w:tblStyle w:val="PlainTable3"/>
+        <w:tblpPr w:leftFromText="141" w:rightFromText="141" w:vertAnchor="text" w:horzAnchor="margin" w:tblpX="1338" w:tblpY="85"/>
+        <w:tblW w:w="0" w:type="auto"/>
+        <w:tblLook w:val="0600" w:firstRow="0" w:lastRow="0" w:firstColumn="0" w:lastColumn="0" w:noHBand="1" w:noVBand="1"/>
+      </w:tblPr>
+      <w:tblGrid>
+        <w:gridCol w:w="5063"/>
+        <w:gridCol w:w="744"/>
+      </w:tblGrid>
+      <w:tr>
+        <w:tc>
+          <w:tcPr>
+            <w:tcW w:w="5063" w:type="dxa"/>
+          </w:tcPr>
+          <w:p>
+            <w:pPr>
+              <w:rPr>
+                <w:rFonts w:cs="Helvetica"/>
+                <w:sz w:val="22"/>
+                <w:szCs w:val="22"/>
+              </w:rPr>
+            </w:pPr>
+            <w:r>
+              <w:rPr>
+                <w:rFonts w:cs="Helvetica"/>
+                <w:sz w:val="22"/>
+                <w:szCs w:val="22"/>
+              </w:rPr>
+              <w:t>Joseph A Ludwig</w:t>
+            </w:r>
+            <w:r>
+              <w:tab/>
+            </w:r>
+          </w:p>
+        </w:tc>
+        <w:tc>
+          <w:tcPr>
+            <w:tcW w:w="744" w:type="dxa"/>
+          </w:tcPr>
+          <w:p>
+            <w:pPr>
+              <w:rPr>
+                <w:rFonts w:cs="Helvetica"/>
+                <w:sz w:val="22"/>
+                <w:szCs w:val="22"/>
+              </w:rPr>
+            </w:pPr>
+            <w:r>
+              <w:rPr>
+                <w:rFonts w:cs="Helvetica"/>
+                <w:sz w:val="22"/>
+                <w:szCs w:val="22"/>
+              </w:rPr>
+              <w:t>Date</w:t>
+            </w:r>
+          </w:p>
+        </w:tc>
+      </w:tr>
+    </w:tbl>
     <w:p>
       <w:pPr>
         <w:spacing w:line="256" w:lineRule="auto"/>
         <w:ind w:left="720" w:firstLine="720"/>
         <w:rPr>
-          <w:rFonts w:cs="Helvetica"/>
-          <w:sz w:val="22"/>
-          <w:szCs w:val="22"/>
-        </w:rPr>
-      </w:pPr>
-      <w:r>
-        <w:rPr>
-          <w:rFonts w:cs="Helvetica"/>
-          <w:sz w:val="22"/>
-          <w:szCs w:val="22"/>
-        </w:rPr>
-        <w:t>Rima Shah Chakrabarti</w:t>
-      </w:r>
+          <w:sz w:val="22"/>
+          <w:szCs w:val="18"/>
+        </w:rPr>
+      </w:pPr>
       <w:r>
         <w:tab/>
       </w:r>
@@ -761,34 +963,14 @@
       </w:r>
       <w:r>
         <w:tab/>
-      </w:r>
-      <w:r>
-        <w:tab/>
-      </w:r>
-      <w:r>
-        <w:rPr>
-          <w:rFonts w:cs="Helvetica"/>
-          <w:sz w:val="22"/>
-          <w:szCs w:val="22"/>
-        </w:rPr>
-        <w:t>Date</w:t>
       </w:r>
     </w:p>
     <w:p>
       <w:pPr>
         <w:rPr>
-          <w:rFonts w:cs="Helvetica"/>
-          <w:sz w:val="22"/>
-          <w:szCs w:val="22"/>
-        </w:rPr>
-      </w:pPr>
-    </w:p>
-    <w:p>
-      <w:pPr>
-        <w:rPr>
           <w:rFonts w:eastAsia="Helvetica" w:cs="Helvetica"/>
-          <w:sz w:val="22"/>
-          <w:szCs w:val="22"/>
+          <w:sz w:val="12"/>
+          <w:szCs w:val="12"/>
         </w:rPr>
       </w:pPr>
     </w:p>
@@ -814,16 +996,15 @@
         <w:pStyle w:val="ListParagraph"/>
         <w:numPr>
           <w:ilvl w:val="0"/>
-          <w:numId w:val="16"/>
+          <w:numId w:val="17"/>
         </w:numPr>
-        <w:contextualSpacing/>
         <w:rPr>
           <w:rFonts w:ascii="Helvetica" w:hAnsi="Helvetica" w:cs="Helvetica"/>
           <w:sz w:val="22"/>
           <w:szCs w:val="22"/>
         </w:rPr>
       </w:pPr>
-      <w:hyperlink r:id="rId12" w:history="1">
+      <w:hyperlink r:id="rId13" w:history="1">
         <w:r>
           <w:rPr>
             <w:rStyle w:val="Hyperlink"/>
@@ -836,14 +1017,14 @@
       </w:hyperlink>
     </w:p>
     <w:sectPr>
-      <w:headerReference w:type="even" r:id="rId13"/>
-      <w:headerReference w:type="default" r:id="rId14"/>
-      <w:footerReference w:type="even" r:id="rId15"/>
-      <w:footerReference w:type="default" r:id="rId16"/>
-      <w:headerReference w:type="first" r:id="rId17"/>
-      <w:footerReference w:type="first" r:id="rId18"/>
+      <w:headerReference w:type="even" r:id="rId14"/>
+      <w:headerReference w:type="default" r:id="rId15"/>
+      <w:footerReference w:type="even" r:id="rId16"/>
+      <w:footerReference w:type="default" r:id="rId17"/>
+      <w:headerReference w:type="first" r:id="rId18"/>
+      <w:footerReference w:type="first" r:id="rId19"/>
       <w:pgSz w:w="12240" w:h="15840" w:code="1"/>
-      <w:pgMar w:top="2347" w:right="1267" w:bottom="1714" w:left="1166" w:header="994" w:footer="259" w:gutter="0"/>
+      <w:pgMar w:top="2347" w:right="1267" w:bottom="426" w:left="1166" w:header="994" w:footer="259" w:gutter="0"/>
       <w:cols w:space="720"/>
       <w:titlePg/>
     </w:sectPr>
@@ -1246,7 +1427,7 @@
                       </a:ln>
                       <a:extLst>
                         <a:ext uri="{91240B29-F687-4f45-9708-019B960494DF}">
-                          <a14:hiddenLine xmlns:mo="http://schemas.microsoft.com/office/mac/office/2008/main" xmlns:mv="urn:schemas-microsoft-com:mac:vml" xmlns="" xmlns:o="urn:schemas-microsoft-com:office:office" xmlns:v="urn:schemas-microsoft-com:vml" xmlns:w10="urn:schemas-microsoft-com:office:word" xmlns:w="http://schemas.openxmlformats.org/wordprocessingml/2006/main" xmlns:a14="http://schemas.microsoft.com/office/drawing/2010/main" xmlns:w16sdtfl="http://schemas.microsoft.com/office/word/2024/wordml/sdtformatlock" xmlns:w16du="http://schemas.microsoft.com/office/word/2023/wordml/word16du" xmlns:oel="http://schemas.microsoft.com/office/2019/extlst" w="9525">
+                          <a14:hiddenLine xmlns:a14="http://schemas.microsoft.com/office/drawing/2010/main" xmlns:w="http://schemas.openxmlformats.org/wordprocessingml/2006/main" xmlns:w10="urn:schemas-microsoft-com:office:word" xmlns:v="urn:schemas-microsoft-com:vml" xmlns:o="urn:schemas-microsoft-com:office:office" xmlns="" xmlns:mv="urn:schemas-microsoft-com:mac:vml" xmlns:mo="http://schemas.microsoft.com/office/mac/office/2008/main" xmlns:w16sdtfl="http://schemas.microsoft.com/office/word/2024/wordml/sdtformatlock" xmlns:w16du="http://schemas.microsoft.com/office/word/2023/wordml/word16du" xmlns:oel="http://schemas.microsoft.com/office/2019/extlst" w="9525">
                             <a:solidFill>
                               <a:srgbClr val="000000"/>
                             </a:solidFill>
@@ -1401,7 +1582,7 @@
               <v:stroke joinstyle="miter"/>
               <v:path gradientshapeok="t" o:connecttype="rect"/>
             </v:shapetype>
-            <v:shape id="Text Box 24" o:spid="_x0000_s1026" type="#_x0000_t202" style="position:absolute;margin-left:161.25pt;margin-top:-12.45pt;width:351pt;height:81pt;z-index:251661824;visibility:visible;mso-wrap-style:square;mso-width-percent:0;mso-height-percent:0;mso-wrap-distance-left:9pt;mso-wrap-distance-top:0;mso-wrap-distance-right:9pt;mso-wrap-distance-bottom:0;mso-position-horizontal:absolute;mso-position-horizontal-relative:text;mso-position-vertical:absolute;mso-position-vertical-relative:text;mso-width-percent:0;mso-height-percent:0;mso-width-relative:page;mso-height-relative:page;v-text-anchor:top" o:gfxdata="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" stroked="f">
+            <v:shape id="Text Box 24" o:spid="_x0000_s1029" type="#_x0000_t202" style="position:absolute;margin-left:161.25pt;margin-top:-12.45pt;width:351pt;height:81pt;z-index:251661824;visibility:visible;mso-wrap-style:square;mso-width-percent:0;mso-height-percent:0;mso-wrap-distance-left:9pt;mso-wrap-distance-top:0;mso-wrap-distance-right:9pt;mso-wrap-distance-bottom:0;mso-position-horizontal:absolute;mso-position-horizontal-relative:text;mso-position-vertical:absolute;mso-position-vertical-relative:text;mso-width-percent:0;mso-height-percent:0;mso-width-relative:page;mso-height-relative:page;v-text-anchor:top" o:gfxdata="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" stroked="f">
               <v:textbox>
                 <w:txbxContent>
                   <w:p>
@@ -1546,7 +1727,7 @@
           <wp:extent cx="1524000" cy="617855"/>
           <wp:effectExtent l="0" t="0" r="0" b="0"/>
           <wp:wrapNone/>
-          <wp:docPr id="27" name="Picture 1" descr="RiceLogo50072dpi"/>
+          <wp:docPr id="182651390" name="Picture 1" descr="RiceLogo50072dpi"/>
           <wp:cNvGraphicFramePr>
             <a:graphicFrameLocks xmlns:a="http://schemas.openxmlformats.org/drawingml/2006/main" noChangeAspect="1"/>
           </wp:cNvGraphicFramePr>
@@ -2168,6 +2349,119 @@
     </w:lvl>
   </w:abstractNum>
   <w:abstractNum w:abstractNumId="13" w15:restartNumberingAfterBreak="0">
+    <w:nsid w:val="1FCA38C9"/>
+    <w:multiLevelType w:val="hybridMultilevel"/>
+    <w:tmpl w:val="577A430C"/>
+    <w:lvl w:ilvl="0" w:tplc="04160001">
+      <w:start w:val="1"/>
+      <w:numFmt w:val="bullet"/>
+      <w:lvlText w:val=""/>
+      <w:lvlJc w:val="left"/>
+      <w:pPr>
+        <w:ind w:left="720" w:hanging="360"/>
+      </w:pPr>
+      <w:rPr>
+        <w:rFonts w:ascii="Symbol" w:hAnsi="Symbol" w:hint="default"/>
+      </w:rPr>
+    </w:lvl>
+    <w:lvl w:ilvl="1" w:tplc="04160003" w:tentative="1">
+      <w:start w:val="1"/>
+      <w:numFmt w:val="bullet"/>
+      <w:lvlText w:val="o"/>
+      <w:lvlJc w:val="left"/>
+      <w:pPr>
+        <w:ind w:left="1440" w:hanging="360"/>
+      </w:pPr>
+      <w:rPr>
+        <w:rFonts w:ascii="Courier New" w:hAnsi="Courier New" w:cs="Courier New" w:hint="default"/>
+      </w:rPr>
+    </w:lvl>
+    <w:lvl w:ilvl="2" w:tplc="04160005" w:tentative="1">
+      <w:start w:val="1"/>
+      <w:numFmt w:val="bullet"/>
+      <w:lvlText w:val=""/>
+      <w:lvlJc w:val="left"/>
+      <w:pPr>
+        <w:ind w:left="2160" w:hanging="360"/>
+      </w:pPr>
+      <w:rPr>
+        <w:rFonts w:ascii="Wingdings" w:hAnsi="Wingdings" w:hint="default"/>
+      </w:rPr>
+    </w:lvl>
+    <w:lvl w:ilvl="3" w:tplc="04160001" w:tentative="1">
+      <w:start w:val="1"/>
+      <w:numFmt w:val="bullet"/>
+      <w:lvlText w:val=""/>
+      <w:lvlJc w:val="left"/>
+      <w:pPr>
+        <w:ind w:left="2880" w:hanging="360"/>
+      </w:pPr>
+      <w:rPr>
+        <w:rFonts w:ascii="Symbol" w:hAnsi="Symbol" w:hint="default"/>
+      </w:rPr>
+    </w:lvl>
+    <w:lvl w:ilvl="4" w:tplc="04160003" w:tentative="1">
+      <w:start w:val="1"/>
+      <w:numFmt w:val="bullet"/>
+      <w:lvlText w:val="o"/>
+      <w:lvlJc w:val="left"/>
+      <w:pPr>
+        <w:ind w:left="3600" w:hanging="360"/>
+      </w:pPr>
+      <w:rPr>
+        <w:rFonts w:ascii="Courier New" w:hAnsi="Courier New" w:cs="Courier New" w:hint="default"/>
+      </w:rPr>
+    </w:lvl>
+    <w:lvl w:ilvl="5" w:tplc="04160005" w:tentative="1">
+      <w:start w:val="1"/>
+      <w:numFmt w:val="bullet"/>
+      <w:lvlText w:val=""/>
+      <w:lvlJc w:val="left"/>
+      <w:pPr>
+        <w:ind w:left="4320" w:hanging="360"/>
+      </w:pPr>
+      <w:rPr>
+        <w:rFonts w:ascii="Wingdings" w:hAnsi="Wingdings" w:hint="default"/>
+      </w:rPr>
+    </w:lvl>
+    <w:lvl w:ilvl="6" w:tplc="04160001" w:tentative="1">
+      <w:start w:val="1"/>
+      <w:numFmt w:val="bullet"/>
+      <w:lvlText w:val=""/>
+      <w:lvlJc w:val="left"/>
+      <w:pPr>
+        <w:ind w:left="5040" w:hanging="360"/>
+      </w:pPr>
+      <w:rPr>
+        <w:rFonts w:ascii="Symbol" w:hAnsi="Symbol" w:hint="default"/>
+      </w:rPr>
+    </w:lvl>
+    <w:lvl w:ilvl="7" w:tplc="04160003" w:tentative="1">
+      <w:start w:val="1"/>
+      <w:numFmt w:val="bullet"/>
+      <w:lvlText w:val="o"/>
+      <w:lvlJc w:val="left"/>
+      <w:pPr>
+        <w:ind w:left="5760" w:hanging="360"/>
+      </w:pPr>
+      <w:rPr>
+        <w:rFonts w:ascii="Courier New" w:hAnsi="Courier New" w:cs="Courier New" w:hint="default"/>
+      </w:rPr>
+    </w:lvl>
+    <w:lvl w:ilvl="8" w:tplc="04160005" w:tentative="1">
+      <w:start w:val="1"/>
+      <w:numFmt w:val="bullet"/>
+      <w:lvlText w:val=""/>
+      <w:lvlJc w:val="left"/>
+      <w:pPr>
+        <w:ind w:left="6480" w:hanging="360"/>
+      </w:pPr>
+      <w:rPr>
+        <w:rFonts w:ascii="Wingdings" w:hAnsi="Wingdings" w:hint="default"/>
+      </w:rPr>
+    </w:lvl>
+  </w:abstractNum>
+  <w:abstractNum w:abstractNumId="14" w15:restartNumberingAfterBreak="0">
     <w:nsid w:val="251B236F"/>
     <w:multiLevelType w:val="hybridMultilevel"/>
     <w:tmpl w:val="47D8AA54"/>
@@ -2280,7 +2574,7 @@
       </w:rPr>
     </w:lvl>
   </w:abstractNum>
-  <w:abstractNum w:abstractNumId="14" w15:restartNumberingAfterBreak="0">
+  <w:abstractNum w:abstractNumId="15" w15:restartNumberingAfterBreak="0">
     <w:nsid w:val="288C3E9E"/>
     <w:multiLevelType w:val="singleLevel"/>
     <w:tmpl w:val="37E252A4"/>
@@ -2301,7 +2595,7 @@
       </w:rPr>
     </w:lvl>
   </w:abstractNum>
-  <w:abstractNum w:abstractNumId="15" w15:restartNumberingAfterBreak="0">
+  <w:abstractNum w:abstractNumId="16" w15:restartNumberingAfterBreak="0">
     <w:nsid w:val="66230FF8"/>
     <w:multiLevelType w:val="singleLevel"/>
     <w:tmpl w:val="CA8A963A"/>
@@ -2326,10 +2620,10 @@
     <w:abstractNumId w:val="9"/>
   </w:num>
   <w:num w:numId="3">
-    <w:abstractNumId w:val="14"/>
+    <w:abstractNumId w:val="15"/>
   </w:num>
   <w:num w:numId="4">
-    <w:abstractNumId w:val="15"/>
+    <w:abstractNumId w:val="16"/>
   </w:num>
   <w:num w:numId="5">
     <w:abstractNumId w:val="12"/>
@@ -2365,6 +2659,9 @@
     <w:abstractNumId w:val="11"/>
   </w:num>
   <w:num w:numId="16">
+    <w:abstractNumId w:val="14"/>
+  </w:num>
+  <w:num w:numId="17">
     <w:abstractNumId w:val="13"/>
   </w:num>
 </w:numbering>
@@ -3286,6 +3583,111 @@
       <w:u w:val="single"/>
     </w:rPr>
   </w:style>
+  <w:style w:type="table" w:styleId="TableGrid">
+    <w:name w:val="Table Grid"/>
+    <w:basedOn w:val="TableNormal"/>
+    <w:rsid w:val="00E72B29"/>
+    <w:tblPr>
+      <w:tblBorders>
+        <w:top w:val="single" w:sz="4" w:space="0" w:color="auto"/>
+        <w:left w:val="single" w:sz="4" w:space="0" w:color="auto"/>
+        <w:bottom w:val="single" w:sz="4" w:space="0" w:color="auto"/>
+        <w:right w:val="single" w:sz="4" w:space="0" w:color="auto"/>
+        <w:insideH w:val="single" w:sz="4" w:space="0" w:color="auto"/>
+        <w:insideV w:val="single" w:sz="4" w:space="0" w:color="auto"/>
+      </w:tblBorders>
+    </w:tblPr>
+  </w:style>
+  <w:style w:type="table" w:styleId="PlainTable3">
+    <w:name w:val="Plain Table 3"/>
+    <w:basedOn w:val="TableNormal"/>
+    <w:uiPriority w:val="43"/>
+    <w:rsid w:val="00E72B29"/>
+    <w:tblPr>
+      <w:tblStyleRowBandSize w:val="1"/>
+      <w:tblStyleColBandSize w:val="1"/>
+    </w:tblPr>
+    <w:tblStylePr w:type="firstRow">
+      <w:rPr>
+        <w:b/>
+        <w:bCs/>
+        <w:caps/>
+      </w:rPr>
+      <w:tblPr/>
+      <w:tcPr>
+        <w:tcBorders>
+          <w:bottom w:val="single" w:sz="4" w:space="0" w:color="7F7F7F" w:themeColor="text1" w:themeTint="80"/>
+        </w:tcBorders>
+      </w:tcPr>
+    </w:tblStylePr>
+    <w:tblStylePr w:type="lastRow">
+      <w:rPr>
+        <w:b/>
+        <w:bCs/>
+        <w:caps/>
+      </w:rPr>
+      <w:tblPr/>
+      <w:tcPr>
+        <w:tcBorders>
+          <w:top w:val="nil"/>
+        </w:tcBorders>
+      </w:tcPr>
+    </w:tblStylePr>
+    <w:tblStylePr w:type="firstCol">
+      <w:rPr>
+        <w:b/>
+        <w:bCs/>
+        <w:caps/>
+      </w:rPr>
+      <w:tblPr/>
+      <w:tcPr>
+        <w:tcBorders>
+          <w:right w:val="single" w:sz="4" w:space="0" w:color="7F7F7F" w:themeColor="text1" w:themeTint="80"/>
+        </w:tcBorders>
+      </w:tcPr>
+    </w:tblStylePr>
+    <w:tblStylePr w:type="lastCol">
+      <w:rPr>
+        <w:b/>
+        <w:bCs/>
+        <w:caps/>
+      </w:rPr>
+      <w:tblPr/>
+      <w:tcPr>
+        <w:tcBorders>
+          <w:left w:val="nil"/>
+        </w:tcBorders>
+      </w:tcPr>
+    </w:tblStylePr>
+    <w:tblStylePr w:type="band1Vert">
+      <w:tblPr/>
+      <w:tcPr>
+        <w:shd w:val="clear" w:color="auto" w:fill="F2F2F2" w:themeFill="background1" w:themeFillShade="F2"/>
+      </w:tcPr>
+    </w:tblStylePr>
+    <w:tblStylePr w:type="band1Horz">
+      <w:tblPr/>
+      <w:tcPr>
+        <w:shd w:val="clear" w:color="auto" w:fill="F2F2F2" w:themeFill="background1" w:themeFillShade="F2"/>
+      </w:tcPr>
+    </w:tblStylePr>
+    <w:tblStylePr w:type="neCell">
+      <w:tblPr/>
+      <w:tcPr>
+        <w:tcBorders>
+          <w:left w:val="nil"/>
+        </w:tcBorders>
+      </w:tcPr>
+    </w:tblStylePr>
+    <w:tblStylePr w:type="nwCell">
+      <w:tblPr/>
+      <w:tcPr>
+        <w:tcBorders>
+          <w:right w:val="nil"/>
+        </w:tcBorders>
+      </w:tcPr>
+    </w:tblStylePr>
+  </w:style>
 </w:styles>
 </file>
 
@@ -3610,12 +4012,25 @@
 </file>
 
 <file path=customXml/item1.xml><?xml version="1.0" encoding="utf-8"?>
+<b:Sources xmlns:b="http://schemas.openxmlformats.org/officeDocument/2006/bibliography" xmlns="http://schemas.openxmlformats.org/officeDocument/2006/bibliography" SelectedStyle="\APASixthEditionOfficeOnline.xsl" StyleName="APA" Version="6"/>
+</file>
+
+<file path=customXml/item2.xml><?xml version="1.0" encoding="utf-8"?>
 <p:properties xmlns:p="http://schemas.microsoft.com/office/2006/metadata/properties" xmlns:xsi="http://www.w3.org/2001/XMLSchema-instance" xmlns:pc="http://schemas.microsoft.com/office/infopath/2007/PartnerControls">
   <documentManagement/>
 </p:properties>
 </file>
 
-<file path=customXml/item2.xml><?xml version="1.0" encoding="utf-8"?>
+<file path=customXml/item3.xml><?xml version="1.0" encoding="utf-8"?>
+<?mso-contentType ?>
+<FormTemplates xmlns="http://schemas.microsoft.com/sharepoint/v3/contenttype/forms">
+  <Display>DocumentLibraryForm</Display>
+  <Edit>DocumentLibraryForm</Edit>
+  <New>DocumentLibraryForm</New>
+</FormTemplates>
+</file>
+
+<file path=customXml/item4.xml><?xml version="1.0" encoding="utf-8"?>
 <ct:contentTypeSchema xmlns:ct="http://schemas.microsoft.com/office/2006/metadata/contentType" xmlns:ma="http://schemas.microsoft.com/office/2006/metadata/properties/metaAttributes" ct:_="" ma:_="" ma:contentTypeName="Document" ma:contentTypeID="0x010100BFC9789DF037164DB137154FB35EE6C2" ma:contentTypeVersion="7" ma:contentTypeDescription="Create a new document." ma:contentTypeScope="" ma:versionID="74220d2be03727763e7743bac4170739">
   <xsd:schema xmlns:xsd="http://www.w3.org/2001/XMLSchema" xmlns:xs="http://www.w3.org/2001/XMLSchema" xmlns:p="http://schemas.microsoft.com/office/2006/metadata/properties" xmlns:ns2="a100a11c-479a-4088-a5ba-97cfa7b2397a" targetNamespace="http://schemas.microsoft.com/office/2006/metadata/properties" ma:root="true" ma:fieldsID="eb704c044c58f0bd2882a76a8f773232" ns2:_="">
     <xsd:import namespace="a100a11c-479a-4088-a5ba-97cfa7b2397a"/>
@@ -3777,16 +4192,15 @@
 </ct:contentTypeSchema>
 </file>
 
-<file path=customXml/item3.xml><?xml version="1.0" encoding="utf-8"?>
-<?mso-contentType ?>
-<FormTemplates xmlns="http://schemas.microsoft.com/sharepoint/v3/contenttype/forms">
-  <Display>DocumentLibraryForm</Display>
-  <Edit>DocumentLibraryForm</Edit>
-  <New>DocumentLibraryForm</New>
-</FormTemplates>
+<file path=customXml/itemProps1.xml><?xml version="1.0" encoding="utf-8"?>
+<ds:datastoreItem xmlns:ds="http://schemas.openxmlformats.org/officeDocument/2006/customXml" ds:itemID="{3695B696-411D-4C80-981C-DB6687B5CCD1}">
+  <ds:schemaRefs>
+    <ds:schemaRef ds:uri="http://schemas.openxmlformats.org/officeDocument/2006/bibliography"/>
+  </ds:schemaRefs>
+</ds:datastoreItem>
 </file>
 
-<file path=customXml/itemProps1.xml><?xml version="1.0" encoding="utf-8"?>
+<file path=customXml/itemProps2.xml><?xml version="1.0" encoding="utf-8"?>
 <ds:datastoreItem xmlns:ds="http://schemas.openxmlformats.org/officeDocument/2006/customXml" ds:itemID="{D39CD005-28E7-4B11-AF22-FCD207A34DBD}">
   <ds:schemaRefs>
     <ds:schemaRef ds:uri="http://schemas.microsoft.com/office/2006/metadata/properties"/>
@@ -3795,7 +4209,15 @@
 </ds:datastoreItem>
 </file>
 
-<file path=customXml/itemProps2.xml><?xml version="1.0" encoding="utf-8"?>
+<file path=customXml/itemProps3.xml><?xml version="1.0" encoding="utf-8"?>
+<ds:datastoreItem xmlns:ds="http://schemas.openxmlformats.org/officeDocument/2006/customXml" ds:itemID="{46EDF751-001A-48BD-B135-4E9C06319D8A}">
+  <ds:schemaRefs>
+    <ds:schemaRef ds:uri="http://schemas.microsoft.com/sharepoint/v3/contenttype/forms"/>
+  </ds:schemaRefs>
+</ds:datastoreItem>
+</file>
+
+<file path=customXml/itemProps4.xml><?xml version="1.0" encoding="utf-8"?>
 <ds:datastoreItem xmlns:ds="http://schemas.openxmlformats.org/officeDocument/2006/customXml" ds:itemID="{B6E51150-DCF1-448F-8D56-65C6F47A19FF}">
   <ds:schemaRefs>
     <ds:schemaRef ds:uri="http://schemas.microsoft.com/office/2006/metadata/contentType"/>
@@ -3811,12 +4233,4 @@
     <ds:schemaRef ds:uri="http://schemas.microsoft.com/internal/obd"/>
   </ds:schemaRefs>
 </ds:datastoreItem>
-</file>
-
-<file path=customXml/itemProps3.xml><?xml version="1.0" encoding="utf-8"?>
-<ds:datastoreItem xmlns:ds="http://schemas.openxmlformats.org/officeDocument/2006/customXml" ds:itemID="{46EDF751-001A-48BD-B135-4E9C06319D8A}">
-  <ds:schemaRefs>
-    <ds:schemaRef ds:uri="http://schemas.microsoft.com/sharepoint/v3/contenttype/forms"/>
-  </ds:schemaRefs>
-</ds:datastoreItem>
 </file>
</xml_diff>